<commit_message>
Preserve the deployed September 29 support, school, and billing work for reproducible releases.
</commit_message>
<xml_diff>
--- a/api/_lib/templates/staff/confidentiality-agreement.docx
+++ b/api/_lib/templates/staff/confidentiality-agreement.docx
@@ -242,6 +242,12 @@
         <w:rPr>
           <w:rtl w:val="0"/>
         </w:rPr>
+      </w:r>
+    </w:p>
+    <w:p>
+      <w:pPr/>
+      <w:r>
+        <w:t>Darbuotojo asmens kodas: {{darbuotojo_asmens_kodas}}. Gyvenamosios vietos adresas: {{darbuotojo_adresas}}.</w:t>
       </w:r>
     </w:p>
     <w:p>

</xml_diff>